<commit_message>
Commit 3. Primeros resultados
se hablo con el profesor de los primeros resultados, tanto en el software de simulacion como con el vuelo del dron
</commit_message>
<xml_diff>
--- a/Quinta semana de Técnicas de Inteligencia Artificial.docx
+++ b/Quinta semana de Técnicas de Inteligencia Artificial.docx
@@ -77,6 +77,35 @@
           <w:rtl w:val="0"/>
         </w:rPr>
         <w:t xml:space="preserve">El dia Martes 22 de septiembre cada integrante del equipo tenía una tarea  diferente relacionado con el proyecto, yo iba a hacer pruebas con el dron, y mis compañeros se encargaron de hacer la simulacion en tinkercard y webots</w:t>
+      </w:r>
+    </w:p>
+    <w:p>
+      <w:pPr>
+        <w:rPr/>
+      </w:pPr>
+      <w:r>
+        <w:rPr>
+          <w:rtl w:val="0"/>
+        </w:rPr>
+      </w:r>
+    </w:p>
+    <w:p>
+      <w:pPr>
+        <w:rPr/>
+      </w:pPr>
+      <w:r>
+        <w:rPr>
+          <w:b w:val="1"/>
+          <w:bCs w:val="1"/>
+          <w:rtl w:val="0"/>
+        </w:rPr>
+        <w:t xml:space="preserve">Actividad 3:</w:t>
+      </w:r>
+      <w:r>
+        <w:rPr>
+          <w:rtl w:val="0"/>
+        </w:rPr>
+        <w:t xml:space="preserve"> El día Jueves 24 de septiembre, hablamos con el profesor sobre nuestros avances, para decirle que el proyecto del dron sigue en pie.</w:t>
       </w:r>
     </w:p>
     <w:sectPr>

</xml_diff>